<commit_message>
Mejora en Modulos Mejora en Menu
</commit_message>
<xml_diff>
--- a/src/documentos/Manual_Tecnico_Frontend_OPT.docx
+++ b/src/documentos/Manual_Tecnico_Frontend_OPT.docx
@@ -2252,6 +2252,12 @@
       <w:pPr/>
       <w:r>
         <w:t>Selector de sucursal en el menú (2026-09-15). Shell (layout/shell/) agrega, junto al menú de navegación, un selector de sucursal (mat-menu, ícono storefront) construido en el cliente: en el constructor pide Sucursales.listar() y lo filtra contra auth.usuarioActual()?.sucursalesAsignadas — deliberadamente sin un endpoint «mis sucursales» nuevo, porque el catálogo por usuario es chico. Con una sola sucursal asignada se muestra de solo lectura (.sucursal-unica, sin flecha de menú: no hay nada entre qué elegir); con más de una, el botón abre el menú y cada ítem llama a Auth.cambiarSucursal(id). En pantallas angostas colapsa a un icon-button con tooltip, igual que el resto de la barra. Ver 4.2 para el detalle de por qué el cambio no reemite el JWT.</w:t>
+      </w:r>
+    </w:p>
+    <w:p>
+      <w:pPr/>
+      <w:r>
+        <w:t>Reorganización del menú de navegación (2026-09-23). layout/shell/shell.ts (gruposNav) pasó de 9 grupos de primer nivel, la mayoría con un solo ítem, a 4 grupos en orden alfabético con sus ítems también alfabéticos: Administración (Empresas, Sucursales, Usuarios; antes «Organización»), Comercial (Clientes, Cobranza, Cobranza: Reporte, Operativos, Órdenes de Trabajo), Inventario (Ajustes, Compras, Enviar, Productos, Recibir, Stock; Productos y Compras dejaron de ser grupos propios) y Reportes (ítem único). Solo cambió la lista de datos: las rutas, el template y el comportamiento móvil (hamburguesa con submenús anidados) no se tocaron. Criterio para ítems nuevos: agregarlos al grupo funcional que corresponda, manteniendo el orden alfabético, y crear un grupo nuevo solo si no encaja en ninguno. No se ejecutaron lint/test ni se verificó en navegador.</w:t>
       </w:r>
     </w:p>
     <w:p>

</xml_diff>